<commit_message>
fix the empty page second
</commit_message>
<xml_diff>
--- a/apps/api/src/modules/notes/investment-note-certificate/templates/islamic-investment-note-certificate-v1.docx
+++ b/apps/api/src/modules/notes/investment-note-certificate/templates/islamic-investment-note-certificate-v1.docx
@@ -2102,12 +2102,6 @@
       <w:r>
         <w:br w:type="page"/>
       </w:r>
-    </w:p>
-    <w:p/>
-    <w:p>
-      <w:pPr>
-        <w:spacing w:after="20"/>
-      </w:pPr>
     </w:p>
     <w:p>
       <w:pPr>

</xml_diff>

<commit_message>
fix extra space (#289)
</commit_message>
<xml_diff>
--- a/apps/api/src/modules/notes/investment-note-certificate/templates/islamic-investment-note-certificate-v1.docx
+++ b/apps/api/src/modules/notes/investment-note-certificate/templates/islamic-investment-note-certificate-v1.docx
@@ -2098,11 +2098,6 @@
         </w:tc>
       </w:tr>
     </w:tbl>
-    <w:p>
-      <w:r>
-        <w:br w:type="page"/>
-      </w:r>
-    </w:p>
     <w:p>
       <w:pPr>
         <w:keepNext/>

</xml_diff>